<commit_message>
polish(submission): synchronize rendered manuscripts with reviewed source
Regenerate the R1 and R3 DOCX and PDF handoff artifacts from the reviewed Markdown so provenance citations, equations, and outcome-count notes match the source.
</commit_message>
<xml_diff>
--- a/05_submission/manuscripts/paper1_working_paper.docx
+++ b/05_submission/manuscripts/paper1_working_paper.docx
@@ -1,8 +1,8 @@
 
 <file path=word/document.xml><?xml version="1.0" encoding="utf-8"?>
-<w:document xmlns:ns1="http://schemas.openxmlformats.org/drawingml/2006/wordprocessingDrawing" xmlns:ns2="http://schemas.openxmlformats.org/drawingml/2006/main" xmlns:ns3="http://schemas.openxmlformats.org/drawingml/2006/picture" xmlns:ns4="http://schemas.openxmlformats.org/officeDocument/2006/relationships" xmlns:w="http://schemas.openxmlformats.org/wordprocessingml/2006/main">
+<w:document xmlns:ns1="http://schemas.openxmlformats.org/officeDocument/2006/math" xmlns:ns2="http://schemas.openxmlformats.org/drawingml/2006/wordprocessingDrawing" xmlns:ns3="http://schemas.openxmlformats.org/drawingml/2006/main" xmlns:ns4="http://schemas.openxmlformats.org/drawingml/2006/picture" xmlns:ns5="http://schemas.openxmlformats.org/officeDocument/2006/relationships" xmlns:w="http://schemas.openxmlformats.org/wordprocessingml/2006/main">
   <w:body>
-    <w:bookmarkStart w:id="30" w:name="Xd4cbe80031f78288f6bd7cbd1a966341008c637"/>
+    <w:bookmarkStart w:id="28" w:name="Xd4cbe80031f78288f6bd7cbd1a966341008c637"/>
     <w:p>
       <w:pPr>
         <w:pStyle w:val="Heading1"/>
@@ -149,7 +149,7 @@
       </w:r>
     </w:p>
     <w:bookmarkEnd w:id="9"/>
-    <w:bookmarkStart w:id="10" w:name="Xe3d0fc0bea9a42ce7605565d0964033d7f6ee47"/>
+    <w:bookmarkStart w:id="10" w:name="introduction"/>
     <w:p>
       <w:pPr>
         <w:pStyle w:val="Heading2"/>
@@ -291,7 +291,7 @@
       </w:r>
     </w:p>
     <w:bookmarkEnd w:id="10"/>
-    <w:bookmarkStart w:id="12" w:name="Xc35801437e32d5e38faa49b170e2e49cc00b476"/>
+    <w:bookmarkStart w:id="12" w:name="data-and-study-population"/>
     <w:p>
       <w:pPr>
         <w:pStyle w:val="Heading2"/>
@@ -305,49 +305,67 @@
         <w:pStyle w:val="FirstParagraph"/>
       </w:pPr>
       <w:r>
-        <w:t xml:space="preserve">The Indonesia Family Life Survey (IFLS) is a longitudinal household survey</w:t>
-      </w:r>
-      <w:r>
-        <w:t xml:space="preserve"> </w:t>
-      </w:r>
-      <w:r>
-        <w:t xml:space="preserve">covering multiple survey waves and a large Indonesian population. The official</w:t>
-      </w:r>
-      <w:r>
-        <w:t xml:space="preserve"> </w:t>
-      </w:r>
-      <w:r>
-        <w:t xml:space="preserve">survey page documents the longitudinal design, geographic coverage, and wave</w:t>
-      </w:r>
-      <w:r>
-        <w:t xml:space="preserve"> </w:t>
-      </w:r>
-      <w:r>
-        <w:t xml:space="preserve">history; the IFLS5 field report provides additional field documentation</w:t>
-      </w:r>
-      <w:r>
-        <w:t xml:space="preserve"> </w:t>
-      </w:r>
-      <w:r>
-        <w:t xml:space="preserve">(RAND, 2016; RAND, n.d.). This first-pass analysis uses the local IFLS files</w:t>
-      </w:r>
-      <w:r>
-        <w:t xml:space="preserve"> </w:t>
-      </w:r>
-      <w:r>
-        <w:t xml:space="preserve">and preserves the original source directory. The exact official source-release</w:t>
-      </w:r>
-      <w:r>
-        <w:t xml:space="preserve"> </w:t>
-      </w:r>
-      <w:r>
-        <w:t xml:space="preserve">identifier is recorded as an open provenance item in the project manifest and</w:t>
-      </w:r>
-      <w:r>
-        <w:t xml:space="preserve"> </w:t>
-      </w:r>
-      <w:r>
-        <w:t xml:space="preserve">must be completed before public replication.</w:t>
+        <w:t xml:space="preserve">The Indonesia Family Life Survey (IFLS) is an ongoing longitudinal survey with</w:t>
+      </w:r>
+      <w:r>
+        <w:t xml:space="preserve"> </w:t>
+      </w:r>
+      <w:r>
+        <w:t xml:space="preserve">repeated waves and information at individual, household, community, and</w:t>
+      </w:r>
+      <w:r>
+        <w:t xml:space="preserve"> </w:t>
+      </w:r>
+      <w:r>
+        <w:t xml:space="preserve">facility levels. RAND’s official study-design and data-notes pages document</w:t>
+      </w:r>
+      <w:r>
+        <w:t xml:space="preserve"> </w:t>
+      </w:r>
+      <w:r>
+        <w:t xml:space="preserve">the wave structure, record units, tracking guidance, skip patterns, and special</w:t>
+      </w:r>
+      <w:r>
+        <w:t xml:space="preserve"> </w:t>
+      </w:r>
+      <w:r>
+        <w:t xml:space="preserve">codes; the IFLS5 field report provides additional field documentation (RAND,</w:t>
+      </w:r>
+      <w:r>
+        <w:t xml:space="preserve"> </w:t>
+      </w:r>
+      <w:r>
+        <w:t xml:space="preserve">2016; RAND, n.d.-a; RAND, n.d.-b; RAND, n.d.-c). RAND’s access page requires</w:t>
+      </w:r>
+      <w:r>
+        <w:t xml:space="preserve"> </w:t>
+      </w:r>
+      <w:r>
+        <w:t xml:space="preserve">registration for public-use data, separates restricted-use access, prohibits</w:t>
+      </w:r>
+      <w:r>
+        <w:t xml:space="preserve"> </w:t>
+      </w:r>
+      <w:r>
+        <w:t xml:space="preserve">redistribution, and requires acknowledgement of IFLS (RAND, n.d.-d). This</w:t>
+      </w:r>
+      <w:r>
+        <w:t xml:space="preserve"> </w:t>
+      </w:r>
+      <w:r>
+        <w:t xml:space="preserve">first-pass analysis uses locally held IFLS files and preserves the original</w:t>
+      </w:r>
+      <w:r>
+        <w:t xml:space="preserve"> </w:t>
+      </w:r>
+      <w:r>
+        <w:t xml:space="preserve">source directory. The exact official source-release identifier and owner</w:t>
+      </w:r>
+      <w:r>
+        <w:t xml:space="preserve"> </w:t>
+      </w:r>
+      <w:r>
+        <w:t xml:space="preserve">access record remain open and are not inferred from local hashes.</w:t>
       </w:r>
     </w:p>
     <w:p>
@@ -388,7 +406,7 @@
         <w:t xml:space="preserve">listwise deletion.</w:t>
       </w:r>
     </w:p>
-    <w:bookmarkStart w:id="11" w:name="table-1-r1-sample-flow-and-support"/>
+    <w:bookmarkStart w:id="11" w:name="table-1.-r1-sample-flow-and-support"/>
     <w:p>
       <w:pPr>
         <w:pStyle w:val="Heading3"/>
@@ -627,7 +645,7 @@
     </w:p>
     <w:bookmarkEnd w:id="11"/>
     <w:bookmarkEnd w:id="12"/>
-    <w:bookmarkStart w:id="16" w:name="Xcb1aa74c09da879e53b4f2c7b42c1b96f448cbe"/>
+    <w:bookmarkStart w:id="16" w:name="Xe4e69e83df90ac8bf2c8bbb2d16e4467ab47e0f"/>
     <w:p>
       <w:pPr>
         <w:pStyle w:val="Heading2"/>
@@ -636,7 +654,7 @@
         <w:t xml:space="preserve">3. Exposure, outcomes, and empirical specification</w:t>
       </w:r>
     </w:p>
-    <w:bookmarkStart w:id="13" w:name="X054cfc68a2b4bb09d0e967e9c3f17740ae9e57a"/>
+    <w:bookmarkStart w:id="13" w:name="treatment-definition"/>
     <w:p>
       <w:pPr>
         <w:pStyle w:val="Heading3"/>
@@ -794,7 +812,7 @@
       </w:r>
     </w:p>
     <w:bookmarkEnd w:id="13"/>
-    <w:bookmarkStart w:id="14" w:name="Xa7cbd054101e00dcc7597c931f0dfb6a04e1437"/>
+    <w:bookmarkStart w:id="14" w:name="adult-outcomes"/>
     <w:p>
       <w:pPr>
         <w:pStyle w:val="Heading3"/>
@@ -878,7 +896,7 @@
       </w:r>
     </w:p>
     <w:bookmarkEnd w:id="14"/>
-    <w:bookmarkStart w:id="15" w:name="X2c9c17c7ff56623c8deca877bff3943144ecaf3"/>
+    <w:bookmarkStart w:id="15" w:name="model"/>
     <w:p>
       <w:pPr>
         <w:pStyle w:val="Heading3"/>
@@ -899,25 +917,116 @@
       <w:pPr>
         <w:pStyle w:val="BodyText"/>
       </w:pPr>
-      <w:r>
-        <w:t xml:space="preserve">[</w:t>
-      </w:r>
-      <w:r>
-        <w:t xml:space="preserve"> </w:t>
-      </w:r>
-      <w:r>
-        <w:t xml:space="preserve">Y_i = \alpha + \beta T_i + \gamma'X_i + \varepsilon_i,</w:t>
-      </w:r>
-      <w:r>
-        <w:t xml:space="preserve"> </w:t>
-      </w:r>
-      <w:r>
-        <w:t xml:space="preserve">]</w:t>
-      </w:r>
-    </w:p>
-    <w:p>
-      <w:pPr>
-        <w:pStyle w:val="BodyText"/>
+      <ns1:oMathPara>
+        <ns1:oMathParaPr>
+          <ns1:jc ns1:val="center"/>
+        </ns1:oMathParaPr>
+        <ns1:oMath>
+          <ns1:sSub>
+            <ns1:e>
+              <ns1:r>
+                <ns1:t>Y</ns1:t>
+              </ns1:r>
+            </ns1:e>
+            <ns1:sub>
+              <ns1:r>
+                <ns1:t>i</ns1:t>
+              </ns1:r>
+            </ns1:sub>
+          </ns1:sSub>
+          <ns1:r>
+            <ns1:rPr>
+              <ns1:sty ns1:val="p"/>
+            </ns1:rPr>
+            <ns1:t>=</ns1:t>
+          </ns1:r>
+          <ns1:r>
+            <ns1:t>α</ns1:t>
+          </ns1:r>
+          <ns1:r>
+            <ns1:rPr>
+              <ns1:sty ns1:val="p"/>
+            </ns1:rPr>
+            <ns1:t>+</ns1:t>
+          </ns1:r>
+          <ns1:r>
+            <ns1:t>β</ns1:t>
+          </ns1:r>
+          <ns1:sSub>
+            <ns1:e>
+              <ns1:r>
+                <ns1:t>T</ns1:t>
+              </ns1:r>
+            </ns1:e>
+            <ns1:sub>
+              <ns1:r>
+                <ns1:t>i</ns1:t>
+              </ns1:r>
+            </ns1:sub>
+          </ns1:sSub>
+          <ns1:r>
+            <ns1:rPr>
+              <ns1:sty ns1:val="p"/>
+            </ns1:rPr>
+            <ns1:t>+</ns1:t>
+          </ns1:r>
+          <ns1:sSup>
+            <ns1:e>
+              <ns1:r>
+                <ns1:t>γ</ns1:t>
+              </ns1:r>
+            </ns1:e>
+            <ns1:sup>
+              <ns1:r>
+                <ns1:rPr>
+                  <ns1:sty ns1:val="p"/>
+                </ns1:rPr>
+                <ns1:t>′</ns1:t>
+              </ns1:r>
+            </ns1:sup>
+          </ns1:sSup>
+          <ns1:sSub>
+            <ns1:e>
+              <ns1:r>
+                <ns1:t>X</ns1:t>
+              </ns1:r>
+            </ns1:e>
+            <ns1:sub>
+              <ns1:r>
+                <ns1:t>i</ns1:t>
+              </ns1:r>
+            </ns1:sub>
+          </ns1:sSub>
+          <ns1:r>
+            <ns1:rPr>
+              <ns1:sty ns1:val="p"/>
+            </ns1:rPr>
+            <ns1:t>+</ns1:t>
+          </ns1:r>
+          <ns1:sSub>
+            <ns1:e>
+              <ns1:r>
+                <ns1:t>ε</ns1:t>
+              </ns1:r>
+            </ns1:e>
+            <ns1:sub>
+              <ns1:r>
+                <ns1:t>i</ns1:t>
+              </ns1:r>
+            </ns1:sub>
+          </ns1:sSub>
+          <ns1:r>
+            <ns1:rPr>
+              <ns1:sty ns1:val="p"/>
+            </ns1:rPr>
+            <ns1:t>,</ns1:t>
+          </ns1:r>
+        </ns1:oMath>
+      </ns1:oMathPara>
+    </w:p>
+    <w:p>
+      <w:pPr>
+        <w:pStyle w:val="FirstParagraph"/>
       </w:pPr>
       <w:r>
         <w:t xml:space="preserve">where (T_i) is the locked migration indicator and (X_i) contains W1 child</w:t>
@@ -975,7 +1084,7 @@
     </w:p>
     <w:bookmarkEnd w:id="15"/>
     <w:bookmarkEnd w:id="16"/>
-    <w:bookmarkStart w:id="23" w:name="X121719332867ee227f0a04b486098cee978c6e6"/>
+    <w:bookmarkStart w:id="23" w:name="results"/>
     <w:p>
       <w:pPr>
         <w:pStyle w:val="Heading2"/>
@@ -984,7 +1093,7 @@
         <w:t xml:space="preserve">4. Results</w:t>
       </w:r>
     </w:p>
-    <w:bookmarkStart w:id="17" w:name="X9bc38f54afd8b9fbd2b101219a8bb20b463b4ce"/>
+    <w:bookmarkStart w:id="17" w:name="headline-estimates"/>
     <w:p>
       <w:pPr>
         <w:pStyle w:val="Heading3"/>
@@ -1019,16 +1128,8 @@
         <w:t xml:space="preserve">items and the explicit below-support result status.</w:t>
       </w:r>
     </w:p>
-    <w:p>
-      <w:pPr>
-        <w:pStyle w:val="BodyText"/>
-      </w:pPr>
-      <w:r>
-        <w:t xml:space="preserve">\newpage</w:t>
-      </w:r>
-    </w:p>
     <w:bookmarkEnd w:id="17"/>
-    <w:bookmarkStart w:id="21" w:name="X66942dd686987eeecc572daf48459a3175ca905"/>
+    <w:bookmarkStart w:id="21" w:name="Xec09d1e7031d1764c6a48fd71e3ab69b784244e"/>
     <w:p>
       <w:pPr>
         <w:pageBreakBefore/>
@@ -1036,20 +1137,56 @@
       </w:pPr>
       <w:r>
         <w:t xml:space="preserve">Table 2. R1 adjusted associations in the common first-pass frame</w:t>
+      </w:r>
+    </w:p>
+    <w:p>
+      <w:pPr>
+        <w:pStyle w:val="FirstParagraph"/>
+      </w:pPr>
+      <w:r>
+        <w:t xml:space="preserve">The</w:t>
+      </w:r>
+      <w:r>
+        <w:t xml:space="preserve"> </w:t>
+      </w:r>
+      <w:r>
+        <w:rPr>
+          <w:rStyle w:val="VerbatimChar"/>
+        </w:rPr>
+        <w:t xml:space="preserve">N / treated</w:t>
+      </w:r>
+      <w:r>
+        <w:t xml:space="preserve"> </w:t>
+      </w:r>
+      <w:r>
+        <w:t xml:space="preserve">column is outcome-specific after valid-code and listwise</w:t>
+      </w:r>
+      <w:r>
+        <w:t xml:space="preserve"> </w:t>
+      </w:r>
+      <w:r>
+        <w:t xml:space="preserve">deletion; it is not the common-frame count of 3,847 observations and 25</w:t>
+      </w:r>
+      <w:r>
+        <w:t xml:space="preserve"> </w:t>
+      </w:r>
+      <w:r>
+        <w:t xml:space="preserve">treated observations.</w:t>
       </w:r>
     </w:p>
     <w:tbl>
       <w:tblPr>
         <w:tblStyle w:val="Table"/>
-        <w:tblW w:type="auto" w:w="0"/>
+        <w:tblW w:type="pct" w:w="5000"/>
+        <w:tblLayout w:type="fixed"/>
         <w:tblLook w:firstRow="1" w:lastRow="0" w:firstColumn="0" w:lastColumn="0" w:noHBand="0" w:noVBand="0" w:val="0020"/>
       </w:tblPr>
       <w:tblGrid>
-        <w:gridCol w:w="1584"/>
-        <w:gridCol w:w="1584"/>
-        <w:gridCol w:w="1584"/>
-        <w:gridCol w:w="1584"/>
-        <w:gridCol w:w="1584"/>
+        <w:gridCol w:w="1250"/>
+        <w:gridCol w:w="1667"/>
+        <w:gridCol w:w="1667"/>
+        <w:gridCol w:w="1667"/>
+        <w:gridCol w:w="1667"/>
       </w:tblGrid>
       <w:tr>
         <w:trPr>
@@ -1609,53 +1746,61 @@
     </w:p>
     <w:p>
       <w:pPr>
-        <w:pStyle w:val="BodyText"/>
+        <w:pStyle w:val="CaptionedFigure"/>
       </w:pPr>
       <w:r>
         <w:drawing>
-          <ns1:inline>
-            <ns1:extent cx="5334000" cy="3876975"/>
-            <ns1:effectExtent b="0" l="0" r="0" t="0"/>
-            <ns1:docPr descr="Figure 1. R1 adjusted coefficients with 95% confidence intervals." title="" id="19" name="Picture"/>
-            <ns2:graphic>
-              <ns2:graphicData uri="http://schemas.openxmlformats.org/drawingml/2006/picture">
-                <ns3:pic>
-                  <ns3:nvPicPr>
-                    <ns3:cNvPr descr="../figures/first_pass_coefficients_R1.png" id="20" name="Picture"/>
-                    <ns3:cNvPicPr>
-                      <ns2:picLocks noChangeArrowheads="1" noChangeAspect="1"/>
-                    </ns3:cNvPicPr>
-                  </ns3:nvPicPr>
-                  <ns3:blipFill>
-                    <ns2:blip ns4:embed="rId18"/>
-                    <ns2:stretch>
-                      <ns2:fillRect/>
-                    </ns2:stretch>
-                  </ns3:blipFill>
-                  <ns3:spPr bwMode="auto">
-                    <ns2:xfrm>
-                      <ns2:off x="0" y="0"/>
-                      <ns2:ext cx="5334000" cy="3876975"/>
-                    </ns2:xfrm>
-                    <ns2:prstGeom prst="rect">
-                      <ns2:avLst/>
-                    </ns2:prstGeom>
-                    <ns2:noFill/>
-                    <ns2:ln w="9525">
-                      <ns2:noFill/>
-                      <ns2:headEnd/>
-                      <ns2:tailEnd/>
-                    </ns2:ln>
-                  </ns3:spPr>
-                </ns3:pic>
-              </ns2:graphicData>
-            </ns2:graphic>
-          </ns1:inline>
+          <ns2:inline>
+            <ns2:extent cx="5334000" cy="3876975"/>
+            <ns2:effectExtent b="0" l="0" r="0" t="0"/>
+            <ns2:docPr descr="Figure 1. R1 adjusted coefficients with 95% confidence intervals." title="" id="19" name="Picture"/>
+            <ns3:graphic>
+              <ns3:graphicData uri="http://schemas.openxmlformats.org/drawingml/2006/picture">
+                <ns4:pic>
+                  <ns4:nvPicPr>
+                    <ns4:cNvPr descr="../figures/first_pass_coefficients_R1.png" id="20" name="Picture"/>
+                    <ns4:cNvPicPr>
+                      <ns3:picLocks noChangeArrowheads="1" noChangeAspect="1"/>
+                    </ns4:cNvPicPr>
+                  </ns4:nvPicPr>
+                  <ns4:blipFill>
+                    <ns3:blip ns5:embed="rId18"/>
+                    <ns3:stretch>
+                      <ns3:fillRect/>
+                    </ns3:stretch>
+                  </ns4:blipFill>
+                  <ns4:spPr bwMode="auto">
+                    <ns3:xfrm>
+                      <ns3:off x="0" y="0"/>
+                      <ns3:ext cx="5334000" cy="3876975"/>
+                    </ns3:xfrm>
+                    <ns3:prstGeom prst="rect">
+                      <ns3:avLst/>
+                    </ns3:prstGeom>
+                    <ns3:noFill/>
+                    <ns3:ln w="9525">
+                      <ns3:noFill/>
+                      <ns3:headEnd/>
+                      <ns3:tailEnd/>
+                    </ns3:ln>
+                  </ns4:spPr>
+                </ns4:pic>
+              </ns3:graphicData>
+            </ns3:graphic>
+          </ns2:inline>
         </w:drawing>
       </w:r>
     </w:p>
+    <w:p>
+      <w:pPr>
+        <w:pStyle w:val="ImageCaption"/>
+      </w:pPr>
+      <w:r>
+        <w:t xml:space="preserve">Figure 1. R1 adjusted coefficients with 95% confidence intervals.</w:t>
+      </w:r>
+    </w:p>
     <w:bookmarkEnd w:id="21"/>
-    <w:bookmarkStart w:id="22" w:name="X626aac9531973e78794f1c7127a638d929b1b67"/>
+    <w:bookmarkStart w:id="22" w:name="descriptive-baseline-information"/>
     <w:p>
       <w:pPr>
         <w:pStyle w:val="Heading3"/>
@@ -1710,7 +1855,7 @@
     </w:p>
     <w:bookmarkEnd w:id="22"/>
     <w:bookmarkEnd w:id="23"/>
-    <w:bookmarkStart w:id="24" w:name="Xac45ba6653fd1fa0b651e552cdb5f2770e82409"/>
+    <w:bookmarkStart w:id="24" w:name="X08013653067c4e4174499bbf7da82b893d4ef1d"/>
     <w:p>
       <w:pPr>
         <w:pStyle w:val="Heading2"/>
@@ -1848,7 +1993,7 @@
       </w:r>
     </w:p>
     <w:bookmarkEnd w:id="24"/>
-    <w:bookmarkStart w:id="25" w:name="X6b297cc947e0db5526be369b1f0f4ddc67b2415"/>
+    <w:bookmarkStart w:id="25" w:name="conclusion"/>
     <w:p>
       <w:pPr>
         <w:pStyle w:val="Heading2"/>
@@ -2024,7 +2169,7 @@
         <w:t xml:space="preserve"> </w:t>
       </w:r>
       <w:r>
-        <w:t xml:space="preserve">estimates were generated by the project's Stata do-files and checked against</w:t>
+        <w:t xml:space="preserve">estimates were generated by the project’s Stata do-files and checked against</w:t>
       </w:r>
       <w:r>
         <w:t xml:space="preserve"> </w:t>
@@ -2048,11 +2193,11 @@
         <w:t xml:space="preserve"> </w:t>
       </w:r>
       <w:r>
-        <w:t xml:space="preserve">for adapting this statement to the target journal's policy.</w:t>
+        <w:t xml:space="preserve">for adapting this statement to the target journal’s policy.</w:t>
       </w:r>
     </w:p>
     <w:bookmarkEnd w:id="26"/>
-    <w:bookmarkStart w:id="29" w:name="references"/>
+    <w:bookmarkStart w:id="27" w:name="references"/>
     <w:p>
       <w:pPr>
         <w:pStyle w:val="Heading2"/>
@@ -2098,21 +2243,16 @@
       <w:r>
         <w:t xml:space="preserve"> </w:t>
       </w:r>
-      <w:hyperlink ns4:id="rId27">
-        <w:r>
-          <w:rPr>
-            <w:rStyle w:val="Hyperlink"/>
-          </w:rPr>
-          <w:t xml:space="preserve">https://www.rand.org/content/dam/rand/pubs/working_papers/WR1100/WR1143z1/RAND_WR1143z1.pdf</w:t>
-        </w:r>
-      </w:hyperlink>
+      <w:r>
+        <w:t xml:space="preserve">https://www.rand.org/content/dam/rand/pubs/working_papers/WR1100/WR1143z1/RAND_WR1143z1.pdf</w:t>
+      </w:r>
     </w:p>
     <w:p>
       <w:pPr>
         <w:pStyle w:val="BodyText"/>
       </w:pPr>
       <w:r>
-        <w:t xml:space="preserve">RAND Corporation. (n.d.).</w:t>
+        <w:t xml:space="preserve">RAND Corporation. (n.d.-a).</w:t>
       </w:r>
       <w:r>
         <w:t xml:space="preserve"> </w:t>
@@ -2130,17 +2270,107 @@
       <w:r>
         <w:t xml:space="preserve"> </w:t>
       </w:r>
-      <w:hyperlink ns4:id="rId28">
-        <w:r>
-          <w:rPr>
-            <w:rStyle w:val="Hyperlink"/>
-          </w:rPr>
-          <w:t xml:space="preserve">https://www.rand.org/health/surveys/FLS/IFLS.html</w:t>
-        </w:r>
-      </w:hyperlink>
-    </w:p>
-    <w:bookmarkEnd w:id="29"/>
-    <w:bookmarkEnd w:id="30"/>
+      <w:r>
+        <w:t xml:space="preserve">https://www.rand.org/health/surveys/FLS/IFLS.html</w:t>
+      </w:r>
+    </w:p>
+    <w:p>
+      <w:pPr>
+        <w:pStyle w:val="BodyText"/>
+      </w:pPr>
+      <w:r>
+        <w:t xml:space="preserve">RAND Corporation. (n.d.-b).</w:t>
+      </w:r>
+      <w:r>
+        <w:t xml:space="preserve"> </w:t>
+      </w:r>
+      <w:r>
+        <w:rPr>
+          <w:i/>
+          <w:iCs/>
+        </w:rPr>
+        <w:t xml:space="preserve">The IFLS Study Design</w:t>
+      </w:r>
+      <w:r>
+        <w:t xml:space="preserve">.</w:t>
+      </w:r>
+      <w:r>
+        <w:t xml:space="preserve"> </w:t>
+      </w:r>
+      <w:r>
+        <w:t xml:space="preserve">https://www.rand.org/health/surveys/FLS/IFLS/study.html</w:t>
+      </w:r>
+    </w:p>
+    <w:p>
+      <w:pPr>
+        <w:pStyle w:val="BodyText"/>
+      </w:pPr>
+      <w:r>
+        <w:t xml:space="preserve">RAND Corporation. (n.d.-c).</w:t>
+      </w:r>
+      <w:r>
+        <w:t xml:space="preserve"> </w:t>
+      </w:r>
+      <w:r>
+        <w:rPr>
+          <w:i/>
+          <w:iCs/>
+        </w:rPr>
+        <w:t xml:space="preserve">IFLS Data Updates, Data Notes, Tips, and FAQs</w:t>
+      </w:r>
+      <w:r>
+        <w:t xml:space="preserve">.</w:t>
+      </w:r>
+      <w:r>
+        <w:t xml:space="preserve"> </w:t>
+      </w:r>
+      <w:r>
+        <w:t xml:space="preserve">https://www.rand.org/health/surveys/FLS/IFLS/datanotes.html</w:t>
+      </w:r>
+    </w:p>
+    <w:p>
+      <w:pPr>
+        <w:pStyle w:val="BodyText"/>
+      </w:pPr>
+      <w:r>
+        <w:t xml:space="preserve">RAND Corporation. (n.d.-d).</w:t>
+      </w:r>
+      <w:r>
+        <w:t xml:space="preserve"> </w:t>
+      </w:r>
+      <w:r>
+        <w:rPr>
+          <w:i/>
+          <w:iCs/>
+        </w:rPr>
+        <w:t xml:space="preserve">Register to Download Indonesian Family Life</w:t>
+      </w:r>
+      <w:r>
+        <w:rPr>
+          <w:i/>
+          <w:iCs/>
+        </w:rPr>
+        <w:t xml:space="preserve"> </w:t>
+      </w:r>
+      <w:r>
+        <w:rPr>
+          <w:i/>
+          <w:iCs/>
+        </w:rPr>
+        <w:t xml:space="preserve">Survey (IFLS) Data</w:t>
+      </w:r>
+      <w:r>
+        <w:t xml:space="preserve">.</w:t>
+      </w:r>
+      <w:r>
+        <w:t xml:space="preserve"> </w:t>
+      </w:r>
+      <w:r>
+        <w:t xml:space="preserve">https://www.rand.org/health/surveys/FLS/IFLS/access.html</w:t>
+      </w:r>
+    </w:p>
+    <w:bookmarkEnd w:id="27"/>
+    <w:bookmarkEnd w:id="28"/>
     <w:sectPr>
       <w:footnotePr>
         <w:numRestart w:val="eachSect"/>

</xml_diff>